<commit_message>
📄 DOCX firmado: PES170612HC4 - 13/2/2026, 7:51:50 p.m.
</commit_message>
<xml_diff>
--- a/data/declaraciones/signed/PES170612HC4.docx
+++ b/data/declaraciones/signed/PES170612HC4.docx
@@ -4184,7 +4184,7 @@
         <w:rPr>
           <w:lang w:val="es-MX"/>
         </w:rPr>
-        <w:t xml:space="preserve">PLATAFORMA EJECUTIVA SMA S.A. DE C.V.</w:t>
+        <w:t xml:space="preserve">PLATAFORMA EJECUTIVA SMA</w:t>
       </w:r>
       <w:proofErr w:type="spellStart"/>
       <w:r>
@@ -4353,7 +4353,7 @@
         <w:rPr>
           <w:lang w:val="es-MX"/>
         </w:rPr>
-        <w:t xml:space="preserve">Fecha: 28 de enero de 2026</w:t>
+        <w:t xml:space="preserve">Fecha: 13 de febrero de 2026</w:t>
       </w:r>
       <w:proofErr w:type="spellStart"/>
       <w:r>

</xml_diff>